<commit_message>
fix(metrics): reconcile valid-format rates, attack attempt definitions, and A7/A8 clarification parity
</commit_message>
<xml_diff>
--- a/paper/TriGuard_v2_Conference_Paper.docx
+++ b/paper/TriGuard_v2_Conference_Paper.docx
@@ -4313,6 +4313,11 @@
         <w:t>• In A3 and A6 (Tier 3 active without Tier 1 tokens), permission-level utility collapses to 0.0%. Because Tier 3 enforces fail-closed verification, the absence of an HMAC token prevents legitimate actions from executing. This proves that Tier 1 capability generation is causally essential.</w:t>
         <w:br/>
         <w:t>• Full TriGuard v2 (A7) establishes the Pareto-optimal frontier: 0.0% Executed ASR, 100.0% Block Rate, and 100.0% permission-level authorization utility.</w:t>
+        <w:br/>
+        <w:br/>
+        <w:t>Clarification Dynamics in Static vs. Dynamic Workflows (A7 vs. A8):</w:t>
+        <w:br/>
+        <w:t>In Table 2, both A7 (with Clarification) and A8 (strict fail-closed, no Clarification) report identical 0.0% Executed ASR and 100.0% permission utility. This parity is attributable to the synthetic nature of standardized InjecAgent test cases: each user prompt is explicit and unambiguous, allowing Tier 1 to issue unambiguous capability scopes without hitting the ambiguity threshold required for clarification. The empirical benefit of the Out-of-Band Clarification Manager is realized in dynamic, open-ended environments where user commands are partially specified. As formally demonstrated in our 4 invariant security unit tests (Section 6), ambiguous context triggers an out-of-band confirmation workflow rather than abrupt execution failure.</w:t>
       </w:r>
     </w:p>
     <w:p>

</xml_diff>